<commit_message>
Data - 10/18/2025 part 2
</commit_message>
<xml_diff>
--- a/Data/Private Data/Data Collections.docx
+++ b/Data/Private Data/Data Collections.docx
@@ -3535,7 +3535,7 @@
           <w:sz w:val="20"/>
           <w:szCs w:val="20"/>
         </w:rPr>
-        <w:t>716</w:t>
+        <w:t>993</w:t>
       </w:r>
       <w:r>
         <w:rPr>
@@ -4840,7 +4840,14 @@
           <w:sz w:val="18"/>
           <w:szCs w:val="18"/>
         </w:rPr>
-        <w:t>68</w:t>
+        <w:t>6</w:t>
+      </w:r>
+      <w:r>
+        <w:rPr>
+          <w:sz w:val="18"/>
+          <w:szCs w:val="18"/>
+        </w:rPr>
+        <w:t>9</w:t>
       </w:r>
       <w:r>
         <w:rPr>

</xml_diff>